<commit_message>
feat(resume): clean PDF + .docx, point links at PDF
- Cleaned .docx: removed double bullets (literal '\u2022 ' was paired
  with the ListBullet style, rendering '\u2022 \u2022 text'), stripped emojis
  from header/skills/certs/achievements for ATS-safety, fixed missing
  spaces between SKILLS categories ('Kubernetes (local)Tools' \u2192 with space).
- Merged unique content from orphan duplicate PCS section into the
  Help Desk role (added 'printer problems', 'service transitions',
  'collaborated on deployments', 'client onboarding'), then deleted
  the orphan section. Paragraph count: 58 \u2192 54.
- Generated PDF via LibreOffice (53KB), shipped alongside cleaned
  .docx (26KB, was 29KB).
- siteConfig.resumePath \u2192 /Maxwell_Nixon_Resume.pdf so browsers preview
  inline instead of forcing a download. Homepage download attributes
  match the new filename.
</commit_message>
<xml_diff>
--- a/public/Maxwell_Nixon_Resume.docx
+++ b/public/Maxwell_Nixon_Resume.docx
@@ -5,8 +5,6 @@
     <w:p>
       <w:r>
         <w:t>MAXWELL NIXON</w:t>
-      </w:r>
-      <w:r>
         <w:br/>
       </w:r>
     </w:p>
@@ -17,34 +15,7 @@
     </w:p>
     <w:p>
       <w:r>
-        <w:t>📞</w:t>
-      </w:r>
-      <w:r>
-        <w:t xml:space="preserve"> 609-923-9437   ✉</w:t>
-      </w:r>
-      <w:r>
-        <w:t>️</w:t>
-      </w:r>
-      <w:r>
-        <w:t xml:space="preserve"> mnixon112@outlook.com   </w:t>
-      </w:r>
-      <w:r>
-        <w:t>🔗</w:t>
-      </w:r>
-      <w:r>
-        <w:t xml:space="preserve"> linkedin.com/in/maxwell-nixon-90351627a   </w:t>
-      </w:r>
-      <w:r>
-        <w:t>💻</w:t>
-      </w:r>
-      <w:r>
-        <w:t xml:space="preserve"> github.com/iMaxwe11   </w:t>
-      </w:r>
-      <w:r>
-        <w:t>📍</w:t>
-      </w:r>
-      <w:r>
-        <w:t xml:space="preserve"> Southampton, NJ</w:t>
+        <w:t xml:space="preserve"> 609-923-9437    mnixon112@outlook.com    linkedin.com/in/maxwell-nixon-90351627a    github.com/iMaxwe11    Southampton, NJ</w:t>
       </w:r>
     </w:p>
     <w:p>
@@ -58,10 +29,7 @@
     </w:p>
     <w:p>
       <w:r>
-        <w:t xml:space="preserve">Cloud-savvy IT technician with </w:t>
-      </w:r>
-      <w:r>
-        <w:t>real-world experience managing infrastructure, supporting end users, and building full-stack automation tools. Skilled in system deployment, scripting, containerization, and data-driven projects. Passionate about reliability, privacy, and self-hosted development.</w:t>
+        <w:t>Cloud-savvy IT technician with real-world experience managing infrastructure, supporting end users, and building full-stack automation tools. Skilled in system deployment, scripting, containerization, and data-driven projects. Passionate about reliability, privacy, and self-hosted development.</w:t>
       </w:r>
     </w:p>
     <w:p>
@@ -75,52 +43,15 @@
     </w:p>
     <w:p>
       <w:r>
-        <w:t>☁</w:t>
-      </w:r>
-      <w:r>
-        <w:t>️</w:t>
-      </w:r>
-      <w:r>
         <w:t xml:space="preserve"> Cloud &amp; DevOps: AWS, Azure, Docker, GitHub Actions, Kubernetes (local)</w:t>
-      </w:r>
-      <w:r>
         <w:br/>
-      </w:r>
-      <w:r>
-        <w:t>💻</w:t>
-      </w:r>
-      <w:r>
         <w:t xml:space="preserve"> Tools &amp; Platforms: FastAPI, Streamlit, Hyper-V, Active Directory</w:t>
-      </w:r>
-      <w:r>
         <w:br/>
-      </w:r>
-      <w:r>
-        <w:t>🧠</w:t>
-      </w:r>
-      <w:r>
-        <w:t xml:space="preserve"> Languages: Python, Bash, YAML, CLI</w:t>
-      </w:r>
-      <w:r>
+        <w:t xml:space="preserve">  Languages: Python, Bash, YAML, CLI</w:t>
         <w:br/>
-      </w:r>
-      <w:r>
-        <w:t>🛠</w:t>
-      </w:r>
-      <w:r>
-        <w:t>️</w:t>
-      </w:r>
-      <w:r>
-        <w:t xml:space="preserve"> Systems: Windows Server, RAID, PXE Imaging, VLANs</w:t>
-      </w:r>
-      <w:r>
+        <w:t xml:space="preserve">  Systems: Windows Server, RAID, PXE Imaging, VLANs</w:t>
         <w:br/>
-      </w:r>
-      <w:r>
-        <w:t>💬</w:t>
-      </w:r>
-      <w:r>
-        <w:t xml:space="preserve"> Soft Skills: Client-facing support, independent troubleshooting, clear communicator</w:t>
+        <w:t xml:space="preserve">  Soft Skills: Client-facing support, independent troubleshooting, clear communicator</w:t>
       </w:r>
     </w:p>
     <w:p>
@@ -151,7 +82,7 @@
         <w:pStyle w:val="ListBullet"/>
       </w:pPr>
       <w:r>
-        <w:t>• Deliver technical support for business clients including law firms and internal infrastructure environments.</w:t>
+        <w:t>Deliver technical support for business clients including law firms and internal infrastructure environments.</w:t>
       </w:r>
     </w:p>
     <w:p>
@@ -159,7 +90,7 @@
         <w:pStyle w:val="ListBullet"/>
       </w:pPr>
       <w:r>
-        <w:t>• Deploy and maintain Windows workstations, printers, networking equipment, and Active Directory policies.</w:t>
+        <w:t>Deploy and maintain Windows workstations, printers, networking equipment, and Active Directory policies.</w:t>
       </w:r>
     </w:p>
     <w:p>
@@ -167,7 +98,7 @@
         <w:pStyle w:val="ListBullet"/>
       </w:pPr>
       <w:r>
-        <w:t>• Lead onsite visits and courtroom setups; resolve support tickets independently using ConnectWise.</w:t>
+        <w:t>Lead onsite visits and courtroom setups; resolve support tickets independently using ConnectWise.</w:t>
       </w:r>
     </w:p>
     <w:p>
@@ -175,7 +106,7 @@
         <w:pStyle w:val="ListBullet"/>
       </w:pPr>
       <w:r>
-        <w:t>• Ensure uptime, troubleshoot across environments, and contribute to client tech planning.</w:t>
+        <w:t>Ensure uptime, troubleshoot across environments, and contribute to client tech planning.</w:t>
       </w:r>
     </w:p>
     <w:p>
@@ -206,7 +137,7 @@
         <w:pStyle w:val="ListBullet"/>
       </w:pPr>
       <w:r>
-        <w:t>• Configure secure local backups, VPN access, and remote user support tools.</w:t>
+        <w:t>Configure secure local backups, VPN access, and remote user support tools.</w:t>
       </w:r>
     </w:p>
     <w:p>
@@ -214,7 +145,7 @@
         <w:pStyle w:val="ListBullet"/>
       </w:pPr>
       <w:r>
-        <w:t>• Proactively identify bottlenecks and resolve day-to-day tech issues to ensure smooth operations.</w:t>
+        <w:t>Proactively identify bottlenecks and resolve day-to-day tech issues to ensure smooth operations.</w:t>
       </w:r>
     </w:p>
     <w:p>
@@ -235,7 +166,7 @@
         <w:pStyle w:val="ListBullet"/>
       </w:pPr>
       <w:r>
-        <w:t>• Served as an onsite IT support technician for multiple clients across New Jersey, Philadelphia, Delaware, and the Shore region.</w:t>
+        <w:t>Served as an onsite IT support technician for multiple clients across New Jersey, Philadelphia, Delaware, and the Shore region, including support during service transitions.</w:t>
       </w:r>
     </w:p>
     <w:p>
@@ -243,7 +174,7 @@
         <w:pStyle w:val="ListBullet"/>
       </w:pPr>
       <w:r>
-        <w:t>• Ensured uninterrupted operations by diagnosing and resolving issues on-site during business hours.</w:t>
+        <w:t>Ensured uninterrupted operations by diagnosing and resolving issues on-site during business hours.</w:t>
       </w:r>
     </w:p>
     <w:p>
@@ -251,7 +182,7 @@
         <w:pStyle w:val="ListBullet"/>
       </w:pPr>
       <w:r>
-        <w:t>• Acted as the daily onsite support tech for RHD (Resources for Human Development), responding to incidents and performing proactive health checks.</w:t>
+        <w:t>Acted as the daily onsite support tech for RHD (Resources for Human Development), responding to incidents and performing proactive health checks.</w:t>
       </w:r>
     </w:p>
     <w:p>
@@ -259,7 +190,7 @@
         <w:pStyle w:val="ListBullet"/>
       </w:pPr>
       <w:r>
-        <w:t>• Handled networking issues, device setups, credential lockouts, VPN configurations, and software updates.</w:t>
+        <w:t>Handled networking issues, device setups, printer problems, credential lockouts, VPN configurations, and software updates.</w:t>
       </w:r>
     </w:p>
     <w:p>
@@ -267,7 +198,7 @@
         <w:pStyle w:val="ListBullet"/>
       </w:pPr>
       <w:r>
-        <w:t>• Escalated complex incidents appropriately and documented all actions via ConnectWise.</w:t>
+        <w:t>Escalated complex incidents appropriately, collaborated on deployments, and documented all actions via ConnectWise. Supported client onboarding and service escalations.</w:t>
       </w:r>
     </w:p>
     <w:p>
@@ -275,36 +206,7 @@
         <w:pStyle w:val="ListBullet"/>
       </w:pPr>
       <w:r>
-        <w:t>• Gained experience adapting quickly to new client environments and supporting diverse infrastructure setups under time pressure.</w:t>
-      </w:r>
-    </w:p>
-    <w:p>
-      <w:r>
-        <w:t>PCS, Cherry Hill, NJ • Early 2023</w:t>
-      </w:r>
-    </w:p>
-    <w:p>
-      <w:pPr>
-        <w:pStyle w:val="ListBullet"/>
-      </w:pPr>
-      <w:r>
-        <w:t>• Resolved VPN, credential, printer, and network problems for clients during service transitions.</w:t>
-      </w:r>
-    </w:p>
-    <w:p>
-      <w:pPr>
-        <w:pStyle w:val="ListBullet"/>
-      </w:pPr>
-      <w:r>
-        <w:t>• Documented infrastructure issues in ConnectWise and collaborated on escalated deployments.</w:t>
-      </w:r>
-    </w:p>
-    <w:p>
-      <w:pPr>
-        <w:pStyle w:val="ListBullet"/>
-      </w:pPr>
-      <w:r>
-        <w:t>• Ensured business continuity during client onboarding and support escalations.</w:t>
+        <w:t>Gained experience adapting quickly to new client environments and supporting diverse infrastructure setups under time pressure.</w:t>
       </w:r>
     </w:p>
     <w:p>
@@ -318,10 +220,7 @@
     </w:p>
     <w:p>
       <w:r>
-        <w:t xml:space="preserve">AZ Lawn Care • </w:t>
-      </w:r>
-      <w:r>
-        <w:t>2018–2023</w:t>
+        <w:t>AZ Lawn Care • 2018–2023</w:t>
       </w:r>
     </w:p>
     <w:p>
@@ -329,7 +228,7 @@
         <w:pStyle w:val="ListBullet"/>
       </w:pPr>
       <w:r>
-        <w:t>• Transitioned from labor support to technical admin, managing QuickBooks invoicing and customer database.</w:t>
+        <w:t>Transitioned from labor support to technical admin, managing QuickBooks invoicing and customer database.</w:t>
       </w:r>
     </w:p>
     <w:p>
@@ -337,7 +236,7 @@
         <w:pStyle w:val="ListBullet"/>
       </w:pPr>
       <w:r>
-        <w:t>• Enabled reliable digital operations during staffing gaps, building trust and operational knowledge.</w:t>
+        <w:t>Enabled reliable digital operations during staffing gaps, building trust and operational knowledge.</w:t>
       </w:r>
     </w:p>
     <w:p>
@@ -361,13 +260,7 @@
     </w:p>
     <w:p>
       <w:r>
-        <w:t xml:space="preserve">Built a cloud-style data pipeline with FastAPI (API layer), Python processor (ETL logic), and Streamlit dashboard. Integrated CI/CD using GitHub Actions and containerized each service with Docker. </w:t>
-      </w:r>
-      <w:r>
-        <w:t>🔗</w:t>
-      </w:r>
-      <w:r>
-        <w:t xml:space="preserve"> github.com/iMaxwe11/smart-data-pipeline</w:t>
+        <w:t>Built a cloud-style data pipeline with FastAPI (API layer), Python processor (ETL logic), and Streamlit dashboard. Integrated CI/CD using GitHub Actions and containerized each service with Docker.  github.com/iMaxwe11/smart-data-pipeline</w:t>
       </w:r>
     </w:p>
     <w:p>
@@ -404,8 +297,6 @@
       </w:pPr>
       <w:r>
         <w:br/>
-      </w:r>
-      <w:r>
         <w:t>Media Server Stack</w:t>
       </w:r>
     </w:p>
@@ -428,12 +319,6 @@
         <w:pStyle w:val="ListBullet"/>
       </w:pPr>
       <w:r>
-        <w:t>🛡</w:t>
-      </w:r>
-      <w:r>
-        <w:t>️</w:t>
-      </w:r>
-      <w:r>
         <w:t xml:space="preserve"> Liongard Administrator – Credential ID: LGCPCbjou5ktz6e (May 2023)</w:t>
       </w:r>
     </w:p>
@@ -441,12 +326,6 @@
       <w:pPr>
         <w:pStyle w:val="ListBullet"/>
       </w:pPr>
-      <w:r>
-        <w:t>🛡</w:t>
-      </w:r>
-      <w:r>
-        <w:t>️</w:t>
-      </w:r>
       <w:r>
         <w:t xml:space="preserve"> Introduction to Liongard – Credential ID: LGCPC97l271xz4b (May 2023)</w:t>
       </w:r>
@@ -456,12 +335,6 @@
         <w:pStyle w:val="ListBullet"/>
       </w:pPr>
       <w:r>
-        <w:t>🛡</w:t>
-      </w:r>
-      <w:r>
-        <w:t>️</w:t>
-      </w:r>
-      <w:r>
         <w:t xml:space="preserve"> Intro to Managed Service Providers – Credential ID: LGCPC8c8cof7atj (May 2023)</w:t>
       </w:r>
     </w:p>
@@ -469,12 +342,6 @@
       <w:pPr>
         <w:pStyle w:val="ListBullet"/>
       </w:pPr>
-      <w:r>
-        <w:t>🛡</w:t>
-      </w:r>
-      <w:r>
-        <w:t>️</w:t>
-      </w:r>
       <w:r>
         <w:t xml:space="preserve"> Troubleshoot Customer Issues Faster – Credential ID: LGCPCtbme1pfiqd (May 2023)</w:t>
       </w:r>
@@ -494,11 +361,6 @@
       </w:pPr>
       <w:r>
         <w:br/>
-      </w:r>
-      <w:r>
-        <w:t>🚀</w:t>
-      </w:r>
-      <w:r>
         <w:t xml:space="preserve"> Full Pipeline Ownership</w:t>
       </w:r>
     </w:p>
@@ -514,11 +376,6 @@
       <w:r>
         <w:lastRenderedPageBreak/>
         <w:br/>
-      </w:r>
-      <w:r>
-        <w:t>🧰</w:t>
-      </w:r>
-      <w:r>
         <w:t xml:space="preserve"> Technical Versatility</w:t>
       </w:r>
     </w:p>
@@ -533,11 +390,6 @@
       </w:pPr>
       <w:r>
         <w:br/>
-      </w:r>
-      <w:r>
-        <w:t>🧠</w:t>
-      </w:r>
-      <w:r>
         <w:t xml:space="preserve"> Self-Driven Learning</w:t>
       </w:r>
     </w:p>
@@ -557,37 +409,7 @@
     </w:p>
     <w:p>
       <w:r>
-        <w:t>🧠</w:t>
-      </w:r>
-      <w:r>
-        <w:t xml:space="preserve"> AI Integration • ⚙</w:t>
-      </w:r>
-      <w:r>
-        <w:t>️</w:t>
-      </w:r>
-      <w:r>
-        <w:t xml:space="preserve"> Home Lab Building • </w:t>
-      </w:r>
-      <w:r>
-        <w:t>🎮</w:t>
-      </w:r>
-      <w:r>
-        <w:t xml:space="preserve"> Open-Source Modding • </w:t>
-      </w:r>
-      <w:r>
-        <w:t>💬</w:t>
-      </w:r>
-      <w:r>
-        <w:t xml:space="preserve"> Tech Community Learning • </w:t>
-      </w:r>
-      <w:r>
-        <w:t>🖥</w:t>
-      </w:r>
-      <w:r>
-        <w:t>️</w:t>
-      </w:r>
-      <w:r>
-        <w:t xml:space="preserve"> Custom PC Performance Tuning</w:t>
+        <w:t xml:space="preserve"> AI Integration •  Home Lab Building •  Open-Source Modding •  Tech Community Learning •  Custom PC Performance Tuning</w:t>
       </w:r>
     </w:p>
     <w:sectPr>

</xml_diff>